<commit_message>
DVR: tilføj Option-rammesætning i Bilag 3A Appendiks C (DVR online)
</commit_message>
<xml_diff>
--- a/Stjernekort/testdata/dvr/11. Bilag 03A_Kravspecifikation_Appendiks C_Brugerflade til DVR online.docx
+++ b/Stjernekort/testdata/dvr/11. Bilag 03A_Kravspecifikation_Appendiks C_Brugerflade til DVR online.docx
@@ -1739,6 +1739,18 @@
       <w:r>
         <w:t xml:space="preserve"> </w:t>
       </w:r>
+    </w:p>
+    <w:p>
+      <w:pPr>
+        <w:rPr>
+          <w:ins w:id="9101" w:author="Claude" w:date="2026-09-30T09:30:00Z"/>
+        </w:rPr>
+      </w:pPr>
+      <w:ins w:id="9102" w:author="Claude" w:date="2026-09-30T09:30:00Z">
+        <w:r>
+          <w:t xml:space="preserve">Dette appendiks beskriver brugerfladen for Optionen, jf. Kontraktens punkt 6.2 og 6.3, og understøtter kravene i bilag 3A, afsnit 2.1, 2.3 og 3.5. Vederlaget for Optionen fremgår af bilag 12, Appendiks A, punkt 8.</w:t>
+        </w:r>
+      </w:ins>
     </w:p>
     <w:p>
       <w:r>

</xml_diff>